<commit_message>
v0.29.34: Resolve LinkedIn Company IDs - fix wrong-tab matching bug
First commit of the experimental Company ID resolver (Settings), built up
over v0.29.25-v0.29.34: looks up each Target Account company on LinkedIn to
resolve its numeric company ID (needed for a future authorCompany-scoped
Post search). The resolver's core bug - it searched LinkedIn's "All" tab,
which unreliably leads with Posts rather than a company "hero card", so any
post merely mentioning a company's name could get matched instead of the
real thing - is fixed by searching the Companies-only tab instead, confirmed
live to raise a 10-company test run from 0 resolved to 4.

Co-Authored-By: Claude Sonnet 5 <noreply@anthropic.com>
</commit_message>
<xml_diff>
--- a/RELEASE_NOTES.docx
+++ b/RELEASE_NOTES.docx
@@ -2,6 +2,1304 @@
 <file path=word/document.xml><?xml version="1.0" encoding="utf-8"?>
 <w:document xmlns:wpc="http://schemas.microsoft.com/office/word/2010/wordprocessingCanvas" xmlns:mo="http://schemas.microsoft.com/office/mac/office/2008/main" xmlns:mc="http://schemas.openxmlformats.org/markup-compatibility/2006" xmlns:mv="urn:schemas-microsoft-com:mac:vml" xmlns:o="urn:schemas-microsoft-com:office:office" xmlns:r="http://schemas.openxmlformats.org/officeDocument/2006/relationships" xmlns:m="http://schemas.openxmlformats.org/officeDocument/2006/math" xmlns:v="urn:schemas-microsoft-com:vml" xmlns:wp14="http://schemas.microsoft.com/office/word/2010/wordprocessingDrawing" xmlns:wp="http://schemas.openxmlformats.org/drawingml/2006/wordprocessingDrawing" xmlns:w10="urn:schemas-microsoft-com:office:word" xmlns:w="http://schemas.openxmlformats.org/wordprocessingml/2006/main" xmlns:w14="http://schemas.microsoft.com/office/word/2010/wordml" xmlns:wpg="http://schemas.microsoft.com/office/word/2010/wordprocessingGroup" xmlns:wpi="http://schemas.microsoft.com/office/word/2010/wordprocessingInk" xmlns:wne="http://schemas.microsoft.com/office/word/2006/wordml" xmlns:wps="http://schemas.microsoft.com/office/word/2010/wordprocessingShape" mc:Ignorable="w14 wp14">
   <w:body>
+    <w:p>
+      <w:pPr>
+        <w:pStyle w:val="Heading1"/>
+      </w:pPr>
+      <w:r>
+        <w:t>SalesTeam — v0.29.34</w:t>
+      </w:r>
+    </w:p>
+    <w:p>
+      <w:pPr>
+        <w:pStyle w:val="Heading2"/>
+      </w:pPr>
+      <w:r>
+        <w:t>Fixed: resolver was searching the wrong LinkedIn tab, matching unrelated companies; switched to the Companies-only tab</w:t>
+      </w:r>
+    </w:p>
+    <w:p>
+      <w:pPr>
+        <w:pStyle w:val="ListBullet"/>
+      </w:pPr>
+      <w:r>
+        <w:t>Reported directly, with real HTML the user shared (not guessed): the v0.29.33 warm-up run surfaced two new, genuinely distinct patterns after the cold-start fix removed the previous hard-timeouts. "Aargauische Kantonalbank" got a real ID (</w:t>
+      </w:r>
+      <w:r>
+        <w:rPr>
+          <w:rFonts w:ascii="Consolas" w:hAnsi="Consolas"/>
+        </w:rPr>
+        <w:t>97930</w:t>
+      </w:r>
+      <w:r>
+        <w:t xml:space="preserve">) but </w:t>
+      </w:r>
+      <w:r>
+        <w:rPr>
+          <w:rFonts w:ascii="Consolas" w:hAnsi="Consolas"/>
+        </w:rPr>
+        <w:t>heroName</w:t>
+      </w:r>
+      <w:r>
+        <w:t xml:space="preserve"> came back </w:t>
+      </w:r>
+      <w:r>
+        <w:rPr>
+          <w:rFonts w:ascii="Consolas" w:hAnsi="Consolas"/>
+        </w:rPr>
+        <w:t>null</w:t>
+      </w:r>
+      <w:r>
+        <w:t xml:space="preserve">; "Acino" got a confident </w:t>
+      </w:r>
+      <w:r>
+        <w:rPr>
+          <w:rFonts w:ascii="Consolas" w:hAnsi="Consolas"/>
+        </w:rPr>
+        <w:t>heroName</w:t>
+      </w:r>
+      <w:r>
+        <w:t xml:space="preserve"> but </w:t>
+      </w:r>
+      <w:r>
+        <w:rPr>
+          <w:rFonts w:ascii="Consolas" w:hAnsi="Consolas"/>
+        </w:rPr>
+        <w:t>currentCompanyIdFound: null</w:t>
+      </w:r>
+      <w:r>
+        <w:t>. Both were previously invisible failure modes, not guessed at.</w:t>
+      </w:r>
+    </w:p>
+    <w:p>
+      <w:pPr>
+        <w:pStyle w:val="ListBullet"/>
+      </w:pPr>
+      <w:r>
+        <w:t>For "Aargauische Kantonalbank": the old content script (</w:t>
+      </w:r>
+      <w:r>
+        <w:rPr>
+          <w:rFonts w:ascii="Consolas" w:hAnsi="Consolas"/>
+        </w:rPr>
+        <w:t>company-resolve-content-script.js</w:t>
+      </w:r>
+      <w:r>
+        <w:t xml:space="preserve">) searched for the hero's name and its </w:t>
+      </w:r>
+      <w:r>
+        <w:rPr>
+          <w:rFonts w:ascii="Consolas" w:hAnsi="Consolas"/>
+        </w:rPr>
+        <w:t>currentCompany</w:t>
+      </w:r>
+      <w:r>
+        <w:t xml:space="preserve"> ID independently, each as its own page-wide first-match lookup - safe only as long as the hero card happens to be first in DOM order for both searches, with no guarantee they're pulling from the same entity. Confirmed against the real hero-card HTML: the name (</w:t>
+      </w:r>
+      <w:r>
+        <w:rPr>
+          <w:rFonts w:ascii="Consolas" w:hAnsi="Consolas"/>
+        </w:rPr>
+        <w:t>&lt;p&gt;</w:t>
+      </w:r>
+      <w:r>
+        <w:t xml:space="preserve">) and the ID-carrying "X connections/alumni work here" link are both genuinely nested inside the SAME </w:t>
+      </w:r>
+      <w:r>
+        <w:rPr>
+          <w:rFonts w:ascii="Consolas" w:hAnsi="Consolas"/>
+        </w:rPr>
+        <w:t>a[href*="linkedin.com/company/..."]</w:t>
+      </w:r>
+      <w:r>
+        <w:t xml:space="preserve"> anchor - LinkedIn builds its DOM via direct element creation rather than HTML parsing, so nested </w:t>
+      </w:r>
+      <w:r>
+        <w:rPr>
+          <w:rFonts w:ascii="Consolas" w:hAnsi="Consolas"/>
+        </w:rPr>
+        <w:t>&lt;a&gt;</w:t>
+      </w:r>
+      <w:r>
+        <w:t xml:space="preserve"> elements are real here, not a parsing artifact. </w:t>
+      </w:r>
+      <w:r>
+        <w:rPr>
+          <w:rFonts w:ascii="Consolas" w:hAnsi="Consolas"/>
+        </w:rPr>
+        <w:t>findCurrentCompanyIdWithin</w:t>
+      </w:r>
+      <w:r>
+        <w:t xml:space="preserve"> now scopes the ID regex to that confirmed hero anchor's own subtree instead of </w:t>
+      </w:r>
+      <w:r>
+        <w:rPr>
+          <w:rFonts w:ascii="Consolas" w:hAnsi="Consolas"/>
+        </w:rPr>
+        <w:t>document.body.innerHTML</w:t>
+      </w:r>
+      <w:r>
+        <w:t>, tying both to the same entity by construction.</w:t>
+      </w:r>
+    </w:p>
+    <w:p>
+      <w:pPr>
+        <w:pStyle w:val="ListBullet"/>
+      </w:pPr>
+      <w:r>
+        <w:t xml:space="preserve">For "Acino": confirmed against the real HTML of Acino's own LinkedIn page that a company page (not the search-results page) carries its own </w:t>
+      </w:r>
+      <w:r>
+        <w:rPr>
+          <w:rFonts w:ascii="Consolas" w:hAnsi="Consolas"/>
+        </w:rPr>
+        <w:t>currentCompany=</w:t>
+      </w:r>
+      <w:r>
+        <w:t xml:space="preserve"> link, under the org-top-card's "X employees" link - though that one can list several IDs in one array (</w:t>
+      </w:r>
+      <w:r>
+        <w:rPr>
+          <w:rFonts w:ascii="Consolas" w:hAnsi="Consolas"/>
+        </w:rPr>
+        <w:t>currentCompany=%5B%22255145%22%2C%22145413%22%2C%222360196%22%5D</w:t>
+      </w:r>
+      <w:r>
+        <w:t xml:space="preserve">), unlike the hero card's single-ID array. When the search page yields a confident name but no ID anywhere, the content script now reports the hero's own company-page URL; </w:t>
+      </w:r>
+      <w:r>
+        <w:rPr>
+          <w:rFonts w:ascii="Consolas" w:hAnsi="Consolas"/>
+        </w:rPr>
+        <w:t>runCompanyIdResolution</w:t>
+      </w:r>
+      <w:r>
+        <w:t xml:space="preserve"> (</w:t>
+      </w:r>
+      <w:r>
+        <w:rPr>
+          <w:rFonts w:ascii="Consolas" w:hAnsi="Consolas"/>
+        </w:rPr>
+        <w:t>company-resolve-extraction.js</w:t>
+      </w:r>
+      <w:r>
+        <w:t xml:space="preserve">) navigates there as a second step and </w:t>
+      </w:r>
+      <w:r>
+        <w:rPr>
+          <w:rFonts w:ascii="Consolas" w:hAnsi="Consolas"/>
+        </w:rPr>
+        <w:t>runCompanyPageFallback</w:t>
+      </w:r>
+      <w:r>
+        <w:t xml:space="preserve"> reads the first ID off that page's own link. Manifest gains a matching </w:t>
+      </w:r>
+      <w:r>
+        <w:rPr>
+          <w:rFonts w:ascii="Consolas" w:hAnsi="Consolas"/>
+        </w:rPr>
+        <w:t>linkedin.com/company/*</w:t>
+      </w:r>
+      <w:r>
+        <w:t xml:space="preserve"> content-script registration, gated the same inert-during-normal-browsing way as every other extraction content script.</w:t>
+      </w:r>
+    </w:p>
+    <w:p>
+      <w:pPr>
+        <w:pStyle w:val="ListBullet"/>
+      </w:pPr>
+      <w:r>
+        <w:t xml:space="preserve">Debug samples now also record </w:t>
+      </w:r>
+      <w:r>
+        <w:rPr>
+          <w:rFonts w:ascii="Consolas" w:hAnsi="Consolas"/>
+        </w:rPr>
+        <w:t>usedFallback</w:t>
+      </w:r>
+      <w:r>
+        <w:t xml:space="preserve"> so a future diagnosis can tell which path a company took.</w:t>
+      </w:r>
+    </w:p>
+    <w:p>
+      <w:pPr>
+        <w:pStyle w:val="ListBullet"/>
+      </w:pPr>
+      <w:r>
+        <w:rPr>
+          <w:b/>
+        </w:rPr>
+        <w:t>Not yet confirmed working</w:t>
+      </w:r>
+      <w:r>
+        <w:t xml:space="preserve">: a follow-up 10-company test run resolved 0. Notably, "Aargauische Kantonalbank" - the exact company whose hero card was used to build the anchor-scoping fix above - came back with both </w:t>
+      </w:r>
+      <w:r>
+        <w:rPr>
+          <w:rFonts w:ascii="Consolas" w:hAnsi="Consolas"/>
+        </w:rPr>
+        <w:t>heroName</w:t>
+      </w:r>
+      <w:r>
+        <w:t xml:space="preserve"> and </w:t>
+      </w:r>
+      <w:r>
+        <w:rPr>
+          <w:rFonts w:ascii="Consolas" w:hAnsi="Consolas"/>
+        </w:rPr>
+        <w:t>currentCompanyIdFound</w:t>
+      </w:r>
+      <w:r>
+        <w:t xml:space="preserve"> null this time, not the "confident name, no id" pattern the fallback targets. Since real evidence already proves a hero card exists for this company, this reads as either a timing issue (the hero anchor hadn't rendered within the poll window this run) or the anchor genuinely wasn't found at all - </w:t>
+      </w:r>
+      <w:r>
+        <w:rPr>
+          <w:rFonts w:ascii="Consolas" w:hAnsi="Consolas"/>
+        </w:rPr>
+        <w:t>heroName</w:t>
+      </w:r>
+      <w:r>
+        <w:t>/</w:t>
+      </w:r>
+      <w:r>
+        <w:rPr>
+          <w:rFonts w:ascii="Consolas" w:hAnsi="Consolas"/>
+        </w:rPr>
+        <w:t>currentCompanyIdFound</w:t>
+      </w:r>
+      <w:r>
+        <w:t xml:space="preserve"> alone can't tell those apart from "hero anchor found but nothing extracted from within it" (a real bug in the scoped extraction). Added </w:t>
+      </w:r>
+      <w:r>
+        <w:rPr>
+          <w:rFonts w:ascii="Consolas" w:hAnsi="Consolas"/>
+        </w:rPr>
+        <w:t>heroLinkFound</w:t>
+      </w:r>
+      <w:r>
+        <w:t>/</w:t>
+      </w:r>
+      <w:r>
+        <w:rPr>
+          <w:rFonts w:ascii="Consolas" w:hAnsi="Consolas"/>
+        </w:rPr>
+        <w:t>heroLinkHref</w:t>
+      </w:r>
+      <w:r>
+        <w:t xml:space="preserve"> to the debug output to disambiguate on the next run before changing any extraction logic further.</w:t>
+      </w:r>
+    </w:p>
+    <w:p>
+      <w:pPr>
+        <w:pStyle w:val="ListBullet"/>
+      </w:pPr>
+      <w:r>
+        <w:rPr>
+          <w:b/>
+        </w:rPr>
+        <w:t>Suspected cause, tried, disproven by the next run</w:t>
+      </w:r>
+      <w:r>
+        <w:t xml:space="preserve">: </w:t>
+      </w:r>
+      <w:r>
+        <w:rPr>
+          <w:rFonts w:ascii="Consolas" w:hAnsi="Consolas"/>
+        </w:rPr>
+        <w:t>heroLinkFound: true</w:t>
+      </w:r>
+      <w:r>
+        <w:t xml:space="preserve">, but </w:t>
+      </w:r>
+      <w:r>
+        <w:rPr>
+          <w:rFonts w:ascii="Consolas" w:hAnsi="Consolas"/>
+        </w:rPr>
+        <w:t>heroLinkHref</w:t>
+      </w:r>
+      <w:r>
+        <w:t xml:space="preserve"> pointed at an entirely unrelated company ("Digiterra powered by Crealogix") - proof that </w:t>
+      </w:r>
+      <w:r>
+        <w:rPr>
+          <w:rFonts w:ascii="Consolas" w:hAnsi="Consolas"/>
+        </w:rPr>
+        <w:t>document.querySelector('a[href*="linkedin.com/company/"]')</w:t>
+      </w:r>
+      <w:r>
+        <w:t xml:space="preserve"> (first match anywhere on the page) isn't reliably the hero card at all. First hypothesis: a sidebar/suggested-companies widget rendering ahead of the real hero card. Tried scoping </w:t>
+      </w:r>
+      <w:r>
+        <w:rPr>
+          <w:rFonts w:ascii="Consolas" w:hAnsi="Consolas"/>
+        </w:rPr>
+        <w:t>findHeroLink</w:t>
+      </w:r>
+      <w:r>
+        <w:t xml:space="preserve"> to </w:t>
+      </w:r>
+      <w:r>
+        <w:rPr>
+          <w:rFonts w:ascii="Consolas" w:hAnsi="Consolas"/>
+        </w:rPr>
+        <w:t>section[aria-label="Primary content"] a[href*="linkedin.com/company/"]</w:t>
+      </w:r>
+      <w:r>
+        <w:t xml:space="preserve"> first, on the theory that the sidebar lives in a preceding </w:t>
+      </w:r>
+      <w:r>
+        <w:rPr>
+          <w:rFonts w:ascii="Consolas" w:hAnsi="Consolas"/>
+        </w:rPr>
+        <w:t>&lt;aside&gt;</w:t>
+      </w:r>
+      <w:r>
+        <w:t xml:space="preserve"> outside that section. </w:t>
+      </w:r>
+      <w:r>
+        <w:rPr>
+          <w:b/>
+        </w:rPr>
+        <w:t>This did not fix it</w:t>
+      </w:r>
+      <w:r>
+        <w:t xml:space="preserve"> - the very next run returned the exact same "Digiterra" result for the same company, plus a new unrelated company ("Intercargo") for "Accelleron Industries," meaning the real cause was something the section scoping couldn't touch.</w:t>
+      </w:r>
+    </w:p>
+    <w:p>
+      <w:pPr>
+        <w:pStyle w:val="ListBullet"/>
+      </w:pPr>
+      <w:r>
+        <w:rPr>
+          <w:b/>
+        </w:rPr>
+        <w:t>Actual root cause, confirmed via a user-shared screenshot</w:t>
+      </w:r>
+      <w:r>
+        <w:t>: the "All" tab (</w:t>
+      </w:r>
+      <w:r>
+        <w:rPr>
+          <w:rFonts w:ascii="Consolas" w:hAnsi="Consolas"/>
+        </w:rPr>
+        <w:t>results/all/</w:t>
+      </w:r>
+      <w:r>
+        <w:t xml:space="preserve">) this resolver searched doesn't reliably lead with a company "hero card" at all - it leads with whatever category ranks first, and that's often Posts. Any company merely MENTIONED inside a post's body text (or its author's own company link) matches </w:t>
+      </w:r>
+      <w:r>
+        <w:rPr>
+          <w:rFonts w:ascii="Consolas" w:hAnsi="Consolas"/>
+        </w:rPr>
+        <w:t>a[href*="linkedin.com/company/"]</w:t>
+      </w:r>
+      <w:r>
+        <w:t xml:space="preserve"> just as well as a genuine top company match would. Confirmed concretely: the top hit for "Aargauische Kantonalbank" was a Digiterra post whose text read "...customer story with Aargauische Kantonalbank (AKB)" - that mention's own link is what kept getting picked up, consistently, run after run.</w:t>
+      </w:r>
+    </w:p>
+    <w:p>
+      <w:pPr>
+        <w:pStyle w:val="ListBullet"/>
+      </w:pPr>
+      <w:r>
+        <w:rPr>
+          <w:b/>
+        </w:rPr>
+        <w:t>Fixed</w:t>
+      </w:r>
+      <w:r>
+        <w:t>: switched the search target from LinkedIn's "All" tab to its Companies-only tab (</w:t>
+      </w:r>
+      <w:r>
+        <w:rPr>
+          <w:rFonts w:ascii="Consolas" w:hAnsi="Consolas"/>
+        </w:rPr>
+        <w:t>results/companies/?keywords=&lt;name&gt;</w:t>
+      </w:r>
+      <w:r>
+        <w:t xml:space="preserve">), confirmed live to show ONLY company results with no Posts/People/Jobs noise. Its result card turned out to be the exact same DOM shape as the original "hero card" (same nested-anchor structure, same "X works here · Y followers" line) - so none of the extraction logic itself needed to change, only </w:t>
+      </w:r>
+      <w:r>
+        <w:rPr>
+          <w:rFonts w:ascii="Consolas" w:hAnsi="Consolas"/>
+        </w:rPr>
+        <w:t>buildCompanyResolveUrl</w:t>
+      </w:r>
+      <w:r>
+        <w:t xml:space="preserve"> (</w:t>
+      </w:r>
+      <w:r>
+        <w:rPr>
+          <w:rFonts w:ascii="Consolas" w:hAnsi="Consolas"/>
+        </w:rPr>
+        <w:t>company-resolve-extraction.js</w:t>
+      </w:r>
+      <w:r>
+        <w:t>) and the matching manifest content-script registration (</w:t>
+      </w:r>
+      <w:r>
+        <w:rPr>
+          <w:rFonts w:ascii="Consolas" w:hAnsi="Consolas"/>
+        </w:rPr>
+        <w:t>linkedin.com/company/*</w:t>
+      </w:r>
+      <w:r>
+        <w:t xml:space="preserve"> search results → </w:t>
+      </w:r>
+      <w:r>
+        <w:rPr>
+          <w:rFonts w:ascii="Consolas" w:hAnsi="Consolas"/>
+        </w:rPr>
+        <w:t>linkedin.com/search/results/companies/*</w:t>
+      </w:r>
+      <w:r>
+        <w:t>). The "Primary content" section scoping from the disproven attempt above is left in place as harmless defense-in-depth, not because it turned out to matter.</w:t>
+      </w:r>
+    </w:p>
+    <w:p>
+      <w:pPr>
+        <w:pStyle w:val="ListBullet"/>
+      </w:pPr>
+      <w:r>
+        <w:rPr>
+          <w:b/>
+        </w:rPr>
+        <w:t>Confirmed working</w:t>
+      </w:r>
+      <w:r>
+        <w:t xml:space="preserve">: a follow-up 10-company test run against the Companies tab resolved 4 (up from 0 on every "All"-tab run before this fix), with the one non-timeout failure ("Accelleron Industries," </w:t>
+      </w:r>
+      <w:r>
+        <w:rPr>
+          <w:rFonts w:ascii="Consolas" w:hAnsi="Consolas"/>
+        </w:rPr>
+        <w:t>heroLinkFound: false</w:t>
+      </w:r>
+      <w:r>
+        <w:t>) being a clean "no result" - correctly declining to guess rather than matching something wrong, not a bug.</w:t>
+      </w:r>
+    </w:p>
+    <w:p>
+      <w:pPr>
+        <w:pStyle w:val="ListBullet"/>
+      </w:pPr>
+      <w:r>
+        <w:rPr>
+          <w:b/>
+        </w:rPr>
+        <w:t>A separate, still-open issue, now with more evidence</w:t>
+      </w:r>
+      <w:r>
+        <w:t>: hard timeouts, unrelated to the tab fix above, remain the dominant failure mode - 5 of 10 in this same run. "Aevis Victoria" hard-timed-out on the search page itself, the same zero-diagnostic pattern previously flagged in v0.29.31/33 as still-unexplained (now seen for a third distinct company, after "Accelleron Industries" and others). "Acino" hard-timed-out for a *second* time specifically on the company-page fallback navigation (</w:t>
+      </w:r>
+      <w:r>
+        <w:rPr>
+          <w:rFonts w:ascii="Consolas" w:hAnsi="Consolas"/>
+        </w:rPr>
+        <w:t>usedFallback: true</w:t>
+      </w:r>
+      <w:r>
+        <w:t>) - no longer a single data point. Given the sheer volume of resolver runs fired against LinkedIn in one session while debugging this, throttling/rate-limiting on LinkedIn's side is a real possibility worth ruling out before writing more extraction code against what might just be slow or degraded responses - not yet investigated.</w:t>
+      </w:r>
+    </w:p>
+    <w:p>
+      <w:pPr>
+        <w:pStyle w:val="Heading1"/>
+      </w:pPr>
+      <w:r>
+        <w:t>SalesTeam — v0.29.33</w:t>
+      </w:r>
+    </w:p>
+    <w:p>
+      <w:pPr>
+        <w:pStyle w:val="Heading2"/>
+      </w:pPr>
+      <w:r>
+        <w:t>Tried: a cold-start warm-up navigation for the Company ID resolver's hard timeouts</w:t>
+      </w:r>
+    </w:p>
+    <w:p>
+      <w:pPr>
+        <w:pStyle w:val="ListBullet"/>
+      </w:pPr>
+      <w:r>
+        <w:t>Reported directly with strong repeat evidence: after confirming the v0.29.31 error-catching fix was actually loaded (reloaded the extension, re-ran), the exact same three companies (Aargauische Kantonalbank, Accelleron Industries, Acino) still hard-timed-out with zero diagnostic info (</w:t>
+      </w:r>
+      <w:r>
+        <w:rPr>
+          <w:rFonts w:ascii="Consolas" w:hAnsi="Consolas"/>
+        </w:rPr>
+        <w:t>navCompleted: true</w:t>
+      </w:r>
+      <w:r>
+        <w:t xml:space="preserve">, nothing else) - no </w:t>
+      </w:r>
+      <w:r>
+        <w:rPr>
+          <w:rFonts w:ascii="Consolas" w:hAnsi="Consolas"/>
+        </w:rPr>
+        <w:t>caughtError</w:t>
+      </w:r>
+      <w:r>
+        <w:t xml:space="preserve"> ever appeared, ruling out an uncaught exception as the cause entirely. Since these never resolve, they never leave the "still missing" pool and land back at the front of every future run's queue - pointing at a cold-start problem with the freshly-created background tab rather than anything about those specific companies: the very first navigation right after </w:t>
+      </w:r>
+      <w:r>
+        <w:rPr>
+          <w:rFonts w:ascii="Consolas" w:hAnsi="Consolas"/>
+        </w:rPr>
+        <w:t>chrome.tabs.create</w:t>
+      </w:r>
+      <w:r>
+        <w:t xml:space="preserve"> may not reliably get the content script running before the orchestration's own 15-second timeout gives up, while every later navigation in the same run works fine once the tab is "warmed up."</w:t>
+      </w:r>
+    </w:p>
+    <w:p>
+      <w:pPr>
+        <w:pStyle w:val="ListBullet"/>
+      </w:pPr>
+      <w:r>
+        <w:t xml:space="preserve">Tried a throwaway warm-up navigation (to </w:t>
+      </w:r>
+      <w:r>
+        <w:rPr>
+          <w:rFonts w:ascii="Consolas" w:hAnsi="Consolas"/>
+        </w:rPr>
+        <w:t>linkedin.com/feed/</w:t>
+      </w:r>
+      <w:r>
+        <w:t>) right after creating the resolver's tab, before the real per-company loop starts - so the first real company lookup is never also the tab's first navigation ever. Marked as a try, not a confirmed fix, since the exact mechanism (if this hypothesis is even right) hasn't been directly observed - worth checking whether these same three companies finally succeed or produce different diagnostic info on the next run.</w:t>
+      </w:r>
+    </w:p>
+    <w:p>
+      <w:pPr>
+        <w:pStyle w:val="Heading1"/>
+      </w:pPr>
+      <w:r>
+        <w:t>SalesTeam — v0.29.32</w:t>
+      </w:r>
+    </w:p>
+    <w:p>
+      <w:pPr>
+        <w:pStyle w:val="Heading2"/>
+      </w:pPr>
+      <w:r>
+        <w:t>Added: resolved-ID progress indicator on Target Accounts, and a fixed completion message that hid a real third outcome</w:t>
+      </w:r>
+    </w:p>
+    <w:p>
+      <w:pPr>
+        <w:pStyle w:val="ListBullet"/>
+      </w:pPr>
+      <w:r>
+        <w:t xml:space="preserve">Reported directly: "Done - 4 of 20 companies resolved, 6 failed due to an error... what about the remaining 10?" The completion message only ever accounted for resolved and hard-timed-out counts, silently omitting a real third outcome - the content script responded fine and quickly, but couldn't confidently confirm a match (no hero card, or the hero name didn't match well enough), correctly declining to guess but invisible in the summary. </w:t>
+      </w:r>
+      <w:r>
+        <w:rPr>
+          <w:rFonts w:ascii="Consolas" w:hAnsi="Consolas"/>
+        </w:rPr>
+        <w:t>runCompanyIdResolution</w:t>
+      </w:r>
+      <w:r>
+        <w:t xml:space="preserve"> (</w:t>
+      </w:r>
+      <w:r>
+        <w:rPr>
+          <w:rFonts w:ascii="Consolas" w:hAnsi="Consolas"/>
+        </w:rPr>
+        <w:t>company-resolve-extraction.js</w:t>
+      </w:r>
+      <w:r>
+        <w:t xml:space="preserve">) now also returns </w:t>
+      </w:r>
+      <w:r>
+        <w:rPr>
+          <w:rFonts w:ascii="Consolas" w:hAnsi="Consolas"/>
+        </w:rPr>
+        <w:t>notConfidentCount</w:t>
+      </w:r>
+      <w:r>
+        <w:t>, and the completion message/Activity Log entry (</w:t>
+      </w:r>
+      <w:r>
+        <w:rPr>
+          <w:rFonts w:ascii="Consolas" w:hAnsi="Consolas"/>
+        </w:rPr>
+        <w:t>settings.js</w:t>
+      </w:r>
+      <w:r>
+        <w:t>) account for all three outcomes so every company in a run is explained.</w:t>
+      </w:r>
+    </w:p>
+    <w:p>
+      <w:pPr>
+        <w:pStyle w:val="ListBullet"/>
+      </w:pPr>
+      <w:r>
+        <w:t>Reported directly: since a resolver run happens in small chunks over many sessions ("Limit to N," v0.29.29), there was no way to see overall progress without re-checking the Activity Log after every run. Added a "LinkedIn company IDs resolved: X of Y" indicator to the Target Accounts Explorer page (</w:t>
+      </w:r>
+      <w:r>
+        <w:rPr>
+          <w:rFonts w:ascii="Consolas" w:hAnsi="Consolas"/>
+        </w:rPr>
+        <w:t>target-accounts.html</w:t>
+      </w:r>
+      <w:r>
+        <w:t>/</w:t>
+      </w:r>
+      <w:r>
+        <w:rPr>
+          <w:rFonts w:ascii="Consolas" w:hAnsi="Consolas"/>
+        </w:rPr>
+        <w:t>.js</w:t>
+      </w:r>
+      <w:r>
+        <w:t>), updating live if a resolver run happens while the page stays open.</w:t>
+      </w:r>
+    </w:p>
+    <w:p>
+      <w:pPr>
+        <w:pStyle w:val="Heading1"/>
+      </w:pPr>
+      <w:r>
+        <w:t>SalesTeam — v0.29.31</w:t>
+      </w:r>
+    </w:p>
+    <w:p>
+      <w:pPr>
+        <w:pStyle w:val="Heading2"/>
+      </w:pPr>
+      <w:r>
+        <w:t>Fixed: resolver hard-timeouts had zero diagnostic info - a silent, uncaught exception was the likely cause</w:t>
+      </w:r>
+    </w:p>
+    <w:p>
+      <w:pPr>
+        <w:pStyle w:val="ListBullet"/>
+      </w:pPr>
+      <w:r>
+        <w:t>Reported directly with a 20-company test run after the v0.29.28 fix: 9 resolved, 6 hard-timed-out with the exact same empty-info pattern as before (</w:t>
+      </w:r>
+      <w:r>
+        <w:rPr>
+          <w:rFonts w:ascii="Consolas" w:hAnsi="Consolas"/>
+        </w:rPr>
+        <w:t>navCompleted: true</w:t>
+      </w:r>
+      <w:r>
+        <w:t xml:space="preserve">, nothing else) - confirmed reproducible across three unrelated real company names (Aargauische Kantonalbank, Accelleron Industries, Acino), none sharing the country-qualifier issue already fixed. </w:t>
+      </w:r>
+      <w:r>
+        <w:rPr>
+          <w:rFonts w:ascii="Consolas" w:hAnsi="Consolas"/>
+        </w:rPr>
+        <w:t>navCompleted: true</w:t>
+      </w:r>
+      <w:r>
+        <w:t xml:space="preserve"> with no message ever received at all means the content script itself never reached its own </w:t>
+      </w:r>
+      <w:r>
+        <w:rPr>
+          <w:rFonts w:ascii="Consolas" w:hAnsi="Consolas"/>
+        </w:rPr>
+        <w:t>sendMessage</w:t>
+      </w:r>
+      <w:r>
+        <w:t xml:space="preserve"> call - the only way that happens is an uncaught exception somewhere in its polling/extraction logic, silently killing it before it could report anything, previously invisible and previously costing the full 15-second orchestration timeout to even notice.</w:t>
+      </w:r>
+    </w:p>
+    <w:p>
+      <w:pPr>
+        <w:pStyle w:val="ListBullet"/>
+      </w:pPr>
+      <w:r>
+        <w:t xml:space="preserve">Wrapped the polling loop in </w:t>
+      </w:r>
+      <w:r>
+        <w:rPr>
+          <w:rFonts w:ascii="Consolas" w:hAnsi="Consolas"/>
+        </w:rPr>
+        <w:t>company-resolve-content-script.js</w:t>
+      </w:r>
+      <w:r>
+        <w:t xml:space="preserve"> in a try/catch that still sends a real result immediately if something throws, with the actual error message attached (</w:t>
+      </w:r>
+      <w:r>
+        <w:rPr>
+          <w:rFonts w:ascii="Consolas" w:hAnsi="Consolas"/>
+        </w:rPr>
+        <w:t>debug.caughtError</w:t>
+      </w:r>
+      <w:r>
+        <w:t>) - converts a mystery 15-second hang into an instant, informative failure. Added a second, outer catch around the whole script as a last resort in case even the initial setup throws.</w:t>
+      </w:r>
+    </w:p>
+    <w:p>
+      <w:pPr>
+        <w:pStyle w:val="ListBullet"/>
+      </w:pPr>
+      <w:r>
+        <w:t xml:space="preserve">Doesn't fix the underlying cause yet (whatever specific error these companies' pages trigger) - but the next run's </w:t>
+      </w:r>
+      <w:r>
+        <w:rPr>
+          <w:rFonts w:ascii="Consolas" w:hAnsi="Consolas"/>
+        </w:rPr>
+        <w:t>debugSamples</w:t>
+      </w:r>
+      <w:r>
+        <w:t xml:space="preserve"> should finally show what it actually is, instead of nothing at all.</w:t>
+      </w:r>
+    </w:p>
+    <w:p>
+      <w:pPr>
+        <w:pStyle w:val="Heading1"/>
+      </w:pPr>
+      <w:r>
+        <w:t>SalesTeam — v0.29.30</w:t>
+      </w:r>
+    </w:p>
+    <w:p>
+      <w:pPr>
+        <w:pStyle w:val="Heading2"/>
+      </w:pPr>
+      <w:r>
+        <w:t>Added: Import/Export Target Accounts buttons on the Target Accounts Explorer page too</w:t>
+      </w:r>
+    </w:p>
+    <w:p>
+      <w:pPr>
+        <w:pStyle w:val="ListBullet"/>
+      </w:pPr>
+      <w:r>
+        <w:t xml:space="preserve">Reported directly: having to leave the Explorer page and go to Settings to back up or refresh the very data it's showing was an unnecessary detour. Added the same "Import Target Accounts…"/"Export Target Accounts…" buttons to the top of </w:t>
+      </w:r>
+      <w:r>
+        <w:rPr>
+          <w:rFonts w:ascii="Consolas" w:hAnsi="Consolas"/>
+        </w:rPr>
+        <w:t>target-accounts.html</w:t>
+      </w:r>
+      <w:r>
+        <w:t xml:space="preserve">, calling the exact same </w:t>
+      </w:r>
+      <w:r>
+        <w:rPr>
+          <w:rFonts w:ascii="Consolas" w:hAnsi="Consolas"/>
+        </w:rPr>
+        <w:t>storage.js</w:t>
+      </w:r>
+      <w:r>
+        <w:t xml:space="preserve"> functions Settings already uses (</w:t>
+      </w:r>
+      <w:r>
+        <w:rPr>
+          <w:rFonts w:ascii="Consolas" w:hAnsi="Consolas"/>
+        </w:rPr>
+        <w:t>importTargetAccounts</w:t>
+      </w:r>
+      <w:r>
+        <w:t>/</w:t>
+      </w:r>
+      <w:r>
+        <w:rPr>
+          <w:rFonts w:ascii="Consolas" w:hAnsi="Consolas"/>
+        </w:rPr>
+        <w:t>importTargetAccountsWorkbook</w:t>
+      </w:r>
+      <w:r>
+        <w:t>/</w:t>
+      </w:r>
+      <w:r>
+        <w:rPr>
+          <w:rFonts w:ascii="Consolas" w:hAnsi="Consolas"/>
+        </w:rPr>
+        <w:t>importTargetAccountsBackup</w:t>
+      </w:r>
+      <w:r>
+        <w:t>/</w:t>
+      </w:r>
+      <w:r>
+        <w:rPr>
+          <w:rFonts w:ascii="Consolas" w:hAnsi="Consolas"/>
+        </w:rPr>
+        <w:t>exportTargetAccountsBackup</w:t>
+      </w:r>
+      <w:r>
+        <w:t>) - Settings remains the source of truth for the score threshold and other Target Account configuration, but the actual import/export actions now work from either page. Import works even before any data has been loaded (from the empty state), and Export only appears once there's something to back up.</w:t>
+      </w:r>
+    </w:p>
+    <w:p>
+      <w:pPr>
+        <w:pStyle w:val="Heading1"/>
+      </w:pPr>
+      <w:r>
+        <w:t>SalesTeam — v0.29.29</w:t>
+      </w:r>
+    </w:p>
+    <w:p>
+      <w:pPr>
+        <w:pStyle w:val="Heading2"/>
+      </w:pPr>
+      <w:r>
+        <w:t>Added: a "Limit to N companies" option for the Company ID resolver</w:t>
+      </w:r>
+    </w:p>
+    <w:p>
+      <w:pPr>
+        <w:pStyle w:val="ListBullet"/>
+      </w:pPr>
+      <w:r>
+        <w:t>Reported directly: after a full day-long resolver run, iterating on a fix by re-running against all ~486 companies each time isn't productive - a quick way to validate a fix on a small sample first was needed. Added an optional "Limit to N" number field next to the "Resolve LinkedIn Company IDs" button (Settings) - leave it blank to resolve everything still missing an ID (unchanged default), or set it to test against just the first N still-unresolved companies, completing in a couple of minutes instead of hours.</w:t>
+      </w:r>
+    </w:p>
+    <w:p>
+      <w:pPr>
+        <w:pStyle w:val="Heading1"/>
+      </w:pPr>
+      <w:r>
+        <w:t>SalesTeam — v0.29.28</w:t>
+      </w:r>
+    </w:p>
+    <w:p>
+      <w:pPr>
+        <w:pStyle w:val="Heading2"/>
+      </w:pPr>
+      <w:r>
+        <w:t>Fixed: Company ID resolver failed for 89% of companies - country-qualified names broke the hero-card match</w:t>
+      </w:r>
+    </w:p>
+    <w:p>
+      <w:pPr>
+        <w:pStyle w:val="ListBullet"/>
+      </w:pPr>
+      <w:r>
+        <w:t xml:space="preserve">Reported directly: a full day-long resolver run reported "28 of 486 companies resolved, 434 failed due to an error." Diagnosed from the run's own </w:t>
+      </w:r>
+      <w:r>
+        <w:rPr>
+          <w:rFonts w:ascii="Consolas" w:hAnsi="Consolas"/>
+        </w:rPr>
+        <w:t>debugSamples</w:t>
+      </w:r>
+      <w:r>
+        <w:t xml:space="preserve"> (Activity Log): most failures weren't timeouts at all - a real </w:t>
+      </w:r>
+      <w:r>
+        <w:rPr>
+          <w:rFonts w:ascii="Consolas" w:hAnsi="Consolas"/>
+        </w:rPr>
+        <w:t>currentCompany=</w:t>
+      </w:r>
+      <w:r>
+        <w:t xml:space="preserve"> ID was found on the page, but the hero-card name extraction came back </w:t>
+      </w:r>
+      <w:r>
+        <w:rPr>
+          <w:rFonts w:ascii="Consolas" w:hAnsi="Consolas"/>
+        </w:rPr>
+        <w:t>null</w:t>
+      </w:r>
+      <w:r>
+        <w:t>, so the resolution was correctly rejected (never guessed) but never counted as a success either.</w:t>
+      </w:r>
+    </w:p>
+    <w:p>
+      <w:pPr>
+        <w:pStyle w:val="ListBullet"/>
+      </w:pPr>
+      <w:r>
+        <w:t>Root cause, confirmed live with real examples ("3M Switzerland," "AbbVie Switzerland"): the Target Accounts sheet marks which subsidiary was researched by appending a country qualifier to the company name, but LinkedIn's own company page is just the global brand ("3M," not "3M Switzerland"). Searching the qualified name never produces LinkedIn's confident "hero card" the resolver depends on - confirmed two ways: LinkedIn's own Companies search tab returned a literal "No results found" for "3M Switzerland," and the general search showed no hero card for it either, while searching "3M" alone produced a clean, verified hero card immediately.</w:t>
+      </w:r>
+    </w:p>
+    <w:p>
+      <w:pPr>
+        <w:pStyle w:val="ListBullet"/>
+      </w:pPr>
+      <w:r>
+        <w:t>Fixed by stripping a trailing country qualifier (" Switzerland," " Schweiz," " Suisse," " Svizzera") from the company name before searching (</w:t>
+      </w:r>
+      <w:r>
+        <w:rPr>
+          <w:rFonts w:ascii="Consolas" w:hAnsi="Consolas"/>
+        </w:rPr>
+        <w:t>stripCountryQualifier</w:t>
+      </w:r>
+      <w:r>
+        <w:t xml:space="preserve">, </w:t>
+      </w:r>
+      <w:r>
+        <w:rPr>
+          <w:rFonts w:ascii="Consolas" w:hAnsi="Consolas"/>
+        </w:rPr>
+        <w:t>company-resolve-extraction.js</w:t>
+      </w:r>
+      <w:r>
+        <w:t>) - the resolved ID still gets written back onto the original Target Account entry regardless of this transformation, only the search query itself changes. Doesn't help a company whose failure was a genuine timeout (e.g. "Aargauische Kantonalbank," a real Swiss-native name with no qualifier to strip) - that's a separate, smaller category not yet addressed.</w:t>
+      </w:r>
+    </w:p>
+    <w:p>
+      <w:pPr>
+        <w:pStyle w:val="Heading1"/>
+      </w:pPr>
+      <w:r>
+        <w:t>SalesTeam — v0.29.27</w:t>
+      </w:r>
+    </w:p>
+    <w:p>
+      <w:pPr>
+        <w:pStyle w:val="Heading2"/>
+      </w:pPr>
+      <w:r>
+        <w:t>Fixed: Target Accounts import silently dropped score-less companies, and re-importing would have wiped resolved LinkedIn IDs</w:t>
+      </w:r>
+    </w:p>
+    <w:p>
+      <w:pPr>
+        <w:pStyle w:val="ListBullet"/>
+      </w:pPr>
+      <w:r>
+        <w:t xml:space="preserve">Reported directly: the Company ID resolver (v0.29.25) reported "486" instead of the expected 500 companies. Root cause: the </w:t>
+      </w:r>
+      <w:r>
+        <w:rPr>
+          <w:rFonts w:ascii="Consolas" w:hAnsi="Consolas"/>
+        </w:rPr>
+        <w:t>.xlsx</w:t>
+      </w:r>
+      <w:r>
+        <w:t xml:space="preserve"> import (</w:t>
+      </w:r>
+      <w:r>
+        <w:rPr>
+          <w:rFonts w:ascii="Consolas" w:hAnsi="Consolas"/>
+        </w:rPr>
+        <w:t>settings.js</w:t>
+      </w:r>
+      <w:r>
+        <w:t xml:space="preserve">) only ever included a company in the lightweight </w:t>
+      </w:r>
+      <w:r>
+        <w:rPr>
+          <w:rFonts w:ascii="Consolas" w:hAnsi="Consolas"/>
+        </w:rPr>
+        <w:t>targetAccounts</w:t>
+      </w:r>
+      <w:r>
+        <w:t xml:space="preserve"> map if it had a non-null AI Priority score - the 14 companies deliberately marked "Out of Scope" (competitors/AI vendors, with no score by design) were silently excluded entirely, so they could never be resolved to a LinkedIn ID or included in the Target Account-scoped Post search (6.16/6.17), for a reason that had nothing to do with search scoping. Verified safe before fixing: </w:t>
+      </w:r>
+      <w:r>
+        <w:rPr>
+          <w:rFonts w:ascii="Consolas" w:hAnsi="Consolas"/>
+        </w:rPr>
+        <w:t>evaluateTargetAccountMatch</w:t>
+      </w:r>
+      <w:r>
+        <w:t xml:space="preserve"> (</w:t>
+      </w:r>
+      <w:r>
+        <w:rPr>
+          <w:rFonts w:ascii="Consolas" w:hAnsi="Consolas"/>
+        </w:rPr>
+        <w:t>storage.js</w:t>
+      </w:r>
+      <w:r>
+        <w:t>) already nulls out any match whose score is null, so including these companies has zero effect on the P1 auto-boost or the AI's signal-weighting - they'll still never qualify. Now imports every company with a name, regardless of score.</w:t>
+      </w:r>
+    </w:p>
+    <w:p>
+      <w:pPr>
+        <w:pStyle w:val="ListBullet"/>
+      </w:pPr>
+      <w:r>
+        <w:t xml:space="preserve">Caught before it could bite: </w:t>
+      </w:r>
+      <w:r>
+        <w:rPr>
+          <w:rFonts w:ascii="Consolas" w:hAnsi="Consolas"/>
+        </w:rPr>
+        <w:t>importTargetAccounts</w:t>
+      </w:r>
+      <w:r>
+        <w:t xml:space="preserve"> (</w:t>
+      </w:r>
+      <w:r>
+        <w:rPr>
+          <w:rFonts w:ascii="Consolas" w:hAnsi="Consolas"/>
+        </w:rPr>
+        <w:t>storage.js</w:t>
+      </w:r>
+      <w:r>
+        <w:t xml:space="preserve">) rebuilds this map from scratch on every import (by design - the workbook is the source of truth for score/label/etc.), but its entries never carried a </w:t>
+      </w:r>
+      <w:r>
+        <w:rPr>
+          <w:rFonts w:ascii="Consolas" w:hAnsi="Consolas"/>
+        </w:rPr>
+        <w:t>linkedinCompanyId</w:t>
+      </w:r>
+      <w:r>
+        <w:t xml:space="preserve"> field forward. Re-importing to pick up the fix above - or any future refresh of the research workbook - would have silently discarded every LinkedIn ID a resolver run had already found, forcing a full re-resolution of the entire list every single time. Now carries a company's resolved ID forward across a re-import, matched by company name - durable data that has nothing to do with whatever changed in a refreshed workbook.</w:t>
+      </w:r>
+    </w:p>
+    <w:p>
+      <w:pPr>
+        <w:pStyle w:val="Heading1"/>
+      </w:pPr>
+      <w:r>
+        <w:t>SalesTeam — v0.29.26</w:t>
+      </w:r>
+    </w:p>
+    <w:p>
+      <w:pPr>
+        <w:pStyle w:val="Heading2"/>
+      </w:pPr>
+      <w:r>
+        <w:t>Added: experimental Target Account-scoped Post search, attacking the Post-vs-Job imbalance at the root</w:t>
+      </w:r>
+    </w:p>
+    <w:p>
+      <w:pPr>
+        <w:pStyle w:val="ListBullet"/>
+      </w:pPr>
+      <w:r>
+        <w:t xml:space="preserve">Completes the plan built up over the last few versions (6.15's diagnosis, 6.16's company-ID resolver): every scan now also searches Posts scoped to resolved Target Account companies via LinkedIn's </w:t>
+      </w:r>
+      <w:r>
+        <w:rPr>
+          <w:rFonts w:ascii="Consolas" w:hAnsi="Consolas"/>
+        </w:rPr>
+        <w:t>authorCompany</w:t>
+      </w:r>
+      <w:r>
+        <w:t xml:space="preserve"> filter, instead of relying purely on each Topic's own unscoped global keyword search - the actual root-cause fix for the imbalance, not just a comparison tool.</w:t>
+      </w:r>
+    </w:p>
+    <w:p>
+      <w:pPr>
+        <w:pStyle w:val="ListBullet"/>
+      </w:pPr>
+      <w:r>
+        <w:t>Every enabled Topic's keywords (both groups, deduplicated) are merged into ONE search per company-chunk - deliberately not one search per Topic per chunk, so this phase's cost depends on total keyword/company volume, not on how many Topics exist (a dedicated search per Topic would multiply instead of add). Resolved company IDs are chunked at 50 per search (</w:t>
+      </w:r>
+      <w:r>
+        <w:rPr>
+          <w:rFonts w:ascii="Consolas" w:hAnsi="Consolas"/>
+        </w:rPr>
+        <w:t>AUTHOR_COMPANY_CHUNK_SIZE</w:t>
+      </w:r>
+      <w:r>
+        <w:t xml:space="preserve">, </w:t>
+      </w:r>
+      <w:r>
+        <w:rPr>
+          <w:rFonts w:ascii="Consolas" w:hAnsi="Consolas"/>
+        </w:rPr>
+        <w:t>background.js</w:t>
+      </w:r>
+      <w:r>
+        <w:t>) - confirmed live that 52 works in one search, staying comfortably under that rather than chasing the exact ceiling.</w:t>
+      </w:r>
+    </w:p>
+    <w:p>
+      <w:pPr>
+        <w:pStyle w:val="ListBullet"/>
+      </w:pPr>
+      <w:r>
+        <w:t>Since a post found this way didn't come from any single Topic's own dedicated search, it's checked locally against every enabled Topic's own full rule (</w:t>
+      </w:r>
+      <w:r>
+        <w:rPr>
+          <w:rFonts w:ascii="Consolas" w:hAnsi="Consolas"/>
+        </w:rPr>
+        <w:t>localTopicMatch</w:t>
+      </w:r>
+      <w:r>
+        <w:t xml:space="preserve">, </w:t>
+      </w:r>
+      <w:r>
+        <w:rPr>
+          <w:rFonts w:ascii="Consolas" w:hAnsi="Consolas"/>
+        </w:rPr>
+        <w:t>background.js</w:t>
+      </w:r>
+      <w:r>
+        <w:t>) - any keyword for a plain OR-topic, or at least one keyword from BOTH groups for an AND-topic. This is a genuine text-based double-check, more rigorous than the existing two-separate-searches-then-join approach used elsewhere in this file, which only ever trusts that both searches happened to surface the same post rather than confirming its text actually contains both kinds of terms.</w:t>
+      </w:r>
+    </w:p>
+    <w:p>
+      <w:pPr>
+        <w:pStyle w:val="ListBullet"/>
+      </w:pPr>
+      <w:r>
+        <w:t>Only activates once at least one Target Account company has a resolved LinkedIn ID (v0.29.25's resolver) - nothing changes for an install that hasn't run that yet.</w:t>
+      </w:r>
+    </w:p>
+    <w:p>
+      <w:pPr>
+        <w:pStyle w:val="Heading1"/>
+      </w:pPr>
+      <w:r>
+        <w:t>SalesTeam — v0.29.25</w:t>
+      </w:r>
+    </w:p>
+    <w:p>
+      <w:pPr>
+        <w:pStyle w:val="Heading2"/>
+      </w:pPr>
+      <w:r>
+        <w:t>Added: experimental LinkedIn Company ID resolver (Settings)</w:t>
+      </w:r>
+    </w:p>
+    <w:p>
+      <w:pPr>
+        <w:pStyle w:val="ListBullet"/>
+      </w:pPr>
+      <w:r>
+        <w:t xml:space="preserve">Follow-up to a new idea for fixing the Post-vs-Job imbalance at the root: rather than searching People by title, search Companies located in Switzerland (from the existing Target Accounts list), then scope Post search to just those companies' employees via LinkedIn's </w:t>
+      </w:r>
+      <w:r>
+        <w:rPr>
+          <w:rFonts w:ascii="Consolas" w:hAnsi="Consolas"/>
+        </w:rPr>
+        <w:t>authorCompany</w:t>
+      </w:r>
+      <w:r>
+        <w:t xml:space="preserve"> filter - confirmed live to genuinely restrict results (a 52-company test list correctly narrowed the results, chip and all). But </w:t>
+      </w:r>
+      <w:r>
+        <w:rPr>
+          <w:rFonts w:ascii="Consolas" w:hAnsi="Consolas"/>
+        </w:rPr>
+        <w:t>authorCompany</w:t>
+      </w:r>
+      <w:r>
+        <w:t xml:space="preserve"> needs LinkedIn's own numeric company IDs, and the Target Accounts data only ever had company names.</w:t>
+      </w:r>
+    </w:p>
+    <w:p>
+      <w:pPr>
+        <w:pStyle w:val="ListBullet"/>
+      </w:pPr>
+      <w:r>
+        <w:t xml:space="preserve">The missing piece was found in real HTML the user shared, not guessed: navigating to </w:t>
+      </w:r>
+      <w:r>
+        <w:rPr>
+          <w:rFonts w:ascii="Consolas" w:hAnsi="Consolas"/>
+        </w:rPr>
+        <w:t>https://www.linkedin.com/search/results/all/?keywords=&lt;name&gt;</w:t>
+      </w:r>
+      <w:r>
+        <w:t xml:space="preserve"> (a plain URL, no autocomplete interaction needed) shows a "hero card" for the best-matching company, and that card's own "X connections/alumni work here" link always encodes </w:t>
+      </w:r>
+      <w:r>
+        <w:rPr>
+          <w:rFonts w:ascii="Consolas" w:hAnsi="Consolas"/>
+        </w:rPr>
+        <w:t>currentCompany=["&lt;id&gt;"]</w:t>
+      </w:r>
+      <w:r>
+        <w:t xml:space="preserve"> - reliably the *first* such occurrence anywhere on the page, before any unrelated "People also viewed" sidebar company. Cross-confirmed twice: Swiss Re's hero card gave </w:t>
+      </w:r>
+      <w:r>
+        <w:rPr>
+          <w:rFonts w:ascii="Consolas" w:hAnsi="Consolas"/>
+        </w:rPr>
+        <w:t>3845</w:t>
+      </w:r>
+      <w:r>
+        <w:t xml:space="preserve"> this way, exactly matching the </w:t>
+      </w:r>
+      <w:r>
+        <w:rPr>
+          <w:rFonts w:ascii="Consolas" w:hAnsi="Consolas"/>
+        </w:rPr>
+        <w:t>heroEntityKey</w:t>
+      </w:r>
+      <w:r>
+        <w:t xml:space="preserve"> LinkedIn's own search-suggestion dropdown had already produced for the same company.</w:t>
+      </w:r>
+    </w:p>
+    <w:p>
+      <w:pPr>
+        <w:pStyle w:val="ListBullet"/>
+      </w:pPr>
+      <w:r>
+        <w:t>New "Resolve LinkedIn Company IDs…" button (Settings, next to Target Accounts) looks up each Target Account company missing an ID this way (</w:t>
+      </w:r>
+      <w:r>
+        <w:rPr>
+          <w:rFonts w:ascii="Consolas" w:hAnsi="Consolas"/>
+        </w:rPr>
+        <w:t>company-resolve-extraction.js</w:t>
+      </w:r>
+      <w:r>
+        <w:t>/</w:t>
+      </w:r>
+      <w:r>
+        <w:rPr>
+          <w:rFonts w:ascii="Consolas" w:hAnsi="Consolas"/>
+        </w:rPr>
+        <w:t>company-resolve-content-script.js</w:t>
+      </w:r>
+      <w:r>
+        <w:t xml:space="preserve">, matching </w:t>
+      </w:r>
+      <w:r>
+        <w:rPr>
+          <w:rFonts w:ascii="Consolas" w:hAnsi="Consolas"/>
+        </w:rPr>
+        <w:t>linkedin.com/search/results/all/*</w:t>
+      </w:r>
+      <w:r>
+        <w:t>, same gating/pacing/timeout pattern as the other extraction modules) and writes the resolved ID onto that company's Target Account record (</w:t>
+      </w:r>
+      <w:r>
+        <w:rPr>
+          <w:rFonts w:ascii="Consolas" w:hAnsi="Consolas"/>
+        </w:rPr>
+        <w:t>linkedinCompanyId</w:t>
+      </w:r>
+      <w:r>
+        <w:t xml:space="preserve">, </w:t>
+      </w:r>
+      <w:r>
+        <w:rPr>
+          <w:rFonts w:ascii="Consolas" w:hAnsi="Consolas"/>
+        </w:rPr>
+        <w:t>applyResolvedCompanyIds</w:t>
+      </w:r>
+      <w:r>
+        <w:t xml:space="preserve">, </w:t>
+      </w:r>
+      <w:r>
+        <w:rPr>
+          <w:rFonts w:ascii="Consolas" w:hAnsi="Consolas"/>
+        </w:rPr>
+        <w:t>storage.js</w:t>
+      </w:r>
+      <w:r>
+        <w:t>). A resolution only counts if the hero card's own displayed name loosely matches the company being searched for - a mismatch is left unresolved, not guessed.</w:t>
+      </w:r>
+    </w:p>
+    <w:p>
+      <w:pPr>
+        <w:pStyle w:val="ListBullet"/>
+      </w:pPr>
+      <w:r>
+        <w:t xml:space="preserve">This is a prerequisite, not the finished feature - the actual company-scoped Post search (chunking resolved IDs into </w:t>
+      </w:r>
+      <w:r>
+        <w:rPr>
+          <w:rFonts w:ascii="Consolas" w:hAnsi="Consolas"/>
+        </w:rPr>
+        <w:t>authorCompany</w:t>
+      </w:r>
+      <w:r>
+        <w:t xml:space="preserve"> batches, merging keywords across topics so search count stays roughly constant regardless of topic count) is separate work, not yet built.</w:t>
+      </w:r>
+    </w:p>
     <w:p>
       <w:pPr>
         <w:pStyle w:val="Heading1"/>

</xml_diff>

<commit_message>
1.2.0: version bump and release notes
Manifest, PRD version line and gen_docs.py mirror at 1.2.0; RELEASE_NOTES 1.2.0 entry
covering the pipeline builds 1.1.4-1.1.9; PRD.docx and RELEASE_NOTES.docx regenerated.

Co-Authored-By: Claude Opus 5.5 <noreply@anthropic.com>
</commit_message>
<xml_diff>
--- a/RELEASE_NOTES.docx
+++ b/RELEASE_NOTES.docx
@@ -2,6 +2,313 @@
 <file path=word/document.xml><?xml version="1.0" encoding="utf-8"?>
 <w:document xmlns:wpc="http://schemas.microsoft.com/office/word/2010/wordprocessingCanvas" xmlns:mo="http://schemas.microsoft.com/office/mac/office/2008/main" xmlns:mc="http://schemas.openxmlformats.org/markup-compatibility/2006" xmlns:mv="urn:schemas-microsoft-com:mac:vml" xmlns:o="urn:schemas-microsoft-com:office:office" xmlns:r="http://schemas.openxmlformats.org/officeDocument/2006/relationships" xmlns:m="http://schemas.openxmlformats.org/officeDocument/2006/math" xmlns:v="urn:schemas-microsoft-com:vml" xmlns:wp14="http://schemas.microsoft.com/office/word/2010/wordprocessingDrawing" xmlns:wp="http://schemas.openxmlformats.org/drawingml/2006/wordprocessingDrawing" xmlns:w10="urn:schemas-microsoft-com:office:word" xmlns:w="http://schemas.openxmlformats.org/wordprocessingml/2006/main" xmlns:w14="http://schemas.microsoft.com/office/word/2010/wordml" xmlns:wpg="http://schemas.microsoft.com/office/word/2010/wordprocessingGroup" xmlns:wpi="http://schemas.microsoft.com/office/word/2010/wordprocessingInk" xmlns:wne="http://schemas.microsoft.com/office/word/2006/wordml" xmlns:wps="http://schemas.microsoft.com/office/word/2010/wordprocessingShape" mc:Ignorable="w14 wp14">
   <w:body>
+    <w:p>
+      <w:pPr>
+        <w:pStyle w:val="Heading1"/>
+      </w:pPr>
+      <w:r>
+        <w:t>SalesTeam — v1.2.0</w:t>
+      </w:r>
+    </w:p>
+    <w:p>
+      <w:pPr>
+        <w:pStyle w:val="Heading2"/>
+      </w:pPr>
+      <w:r>
+        <w:t>Accounts kept ready automatically: one pipeline instead of twelve maintenance tools (builds 1.1.4-1.1.9)</w:t>
+      </w:r>
+    </w:p>
+    <w:p>
+      <w:pPr>
+        <w:pStyle w:val="ListBullet"/>
+      </w:pPr>
+      <w:r>
+        <w:rPr>
+          <w:b/>
+        </w:rPr>
+        <w:t>Keep my accounts ready automatically</w:t>
+      </w:r>
+      <w:r>
+        <w:t xml:space="preserve"> - you start it once (at the end of the Setup wizard, or on the one-time card existing users see after updating); from then on SalesTeam links accounts to their LinkedIn company page, confirms their size and finds their key contacts by itself, one account at a time, in a small window of its own, visible in your browser. It is </w:t>
+      </w:r>
+      <w:r>
+        <w:rPr>
+          <w:b/>
+        </w:rPr>
+        <w:t>off until you turn it on</w:t>
+      </w:r>
+      <w:r>
+        <w:t xml:space="preserve">, and can be turned off at any time in </w:t>
+      </w:r>
+      <w:r>
+        <w:rPr>
+          <w:b/>
+        </w:rPr>
+        <w:t>Settings &gt; Automation</w:t>
+      </w:r>
+      <w:r>
+        <w:t>.</w:t>
+      </w:r>
+    </w:p>
+    <w:p>
+      <w:pPr>
+        <w:pStyle w:val="ListBullet"/>
+      </w:pPr>
+      <w:r>
+        <w:rPr>
+          <w:b/>
+        </w:rPr>
+        <w:t>Within your daily LinkedIn limit</w:t>
+      </w:r>
+      <w:r>
+        <w:t xml:space="preserve"> - automatic preparation uses at most 60 LinkedIn page visits in any 24 hours, leaving the rest of the daily limit for your own scans. It </w:t>
+      </w:r>
+      <w:r>
+        <w:rPr>
+          <w:b/>
+        </w:rPr>
+        <w:t>makes way</w:t>
+      </w:r>
+      <w:r>
+        <w:t xml:space="preserve"> for any job you start (a scan, web research, Discovery, the Advanced tools): the account in progress is finished, your job runs, and preparation resumes by itself afterwards. A full backup from the last 24 hours is required before an automatic run starts.</w:t>
+      </w:r>
+    </w:p>
+    <w:p>
+      <w:pPr>
+        <w:pStyle w:val="ListBullet"/>
+      </w:pPr>
+      <w:r>
+        <w:rPr>
+          <w:b/>
+        </w:rPr>
+        <w:t>Pipeline status</w:t>
+      </w:r>
+      <w:r>
+        <w:t xml:space="preserve"> - a new first pie on the Target Accounts Dashboard shows how many accounts are Ready, Usable, Needs your decision, Lacking evidence and so on, with one status line under it (what is being worked on, when the limit frees up, or that all accounts are processed) and a "Still to do" count per missing field. Clicking a slice filters the table through the new </w:t>
+      </w:r>
+      <w:r>
+        <w:rPr>
+          <w:b/>
+        </w:rPr>
+        <w:t>Readiness</w:t>
+      </w:r>
+      <w:r>
+        <w:t xml:space="preserve"> column; hovering a Readiness pill lists what the account still lacks.</w:t>
+      </w:r>
+    </w:p>
+    <w:p>
+      <w:pPr>
+        <w:pStyle w:val="ListBullet"/>
+      </w:pPr>
+      <w:r>
+        <w:rPr>
+          <w:b/>
+        </w:rPr>
+        <w:t>A quiet status pill</w:t>
+      </w:r>
+      <w:r>
+        <w:t xml:space="preserve"> at the bottom right of every SalesTeam page while preparation runs, with </w:t>
+      </w:r>
+      <w:r>
+        <w:rPr>
+          <w:b/>
+        </w:rPr>
+        <w:t>Pause</w:t>
+      </w:r>
+      <w:r>
+        <w:t xml:space="preserve"> (off for the rest of the day; </w:t>
+      </w:r>
+      <w:r>
+        <w:rPr>
+          <w:b/>
+        </w:rPr>
+        <w:t>Resume today</w:t>
+      </w:r>
+      <w:r>
+        <w:t xml:space="preserve"> in Settings &gt; Automation). Automatic runs show no pop-up; what they did goes to the Activity Log.</w:t>
+      </w:r>
+    </w:p>
+    <w:p>
+      <w:pPr>
+        <w:pStyle w:val="ListBullet"/>
+      </w:pPr>
+      <w:r>
+        <w:rPr>
+          <w:b/>
+        </w:rPr>
+        <w:t>Verified, not just filled</w:t>
+      </w:r>
+      <w:r>
+        <w:t xml:space="preserve"> - every account field now records where its value came from and when it was confirmed. LinkedIn company ids stored before 1.2 are re-checked against the account's own LinkedIn page, and the company size is read on the same visit (a stored headcount inside LinkedIn's band is kept as more precise; one outside it is replaced, with the old value kept in the trace).</w:t>
+      </w:r>
+    </w:p>
+    <w:p>
+      <w:pPr>
+        <w:pStyle w:val="ListBullet"/>
+      </w:pPr>
+      <w:r>
+        <w:rPr>
+          <w:b/>
+        </w:rPr>
+        <w:t>Finding a known person's LinkedIn profile</w:t>
+      </w:r>
+      <w:r>
+        <w:t xml:space="preserve"> - where the research already names a senior contact but has no LinkedIn profile for them (or only a news article), SalesTeam searches the company's People tab for that name and accepts only an exact, unambiguous match. It never guesses. If nobody known is found, ordinary contact discovery by title takes over.</w:t>
+      </w:r>
+    </w:p>
+    <w:p>
+      <w:pPr>
+        <w:pStyle w:val="ListBullet"/>
+      </w:pPr>
+      <w:r>
+        <w:rPr>
+          <w:b/>
+        </w:rPr>
+        <w:t>Decisions</w:t>
+      </w:r>
+      <w:r>
+        <w:t xml:space="preserve"> (new menu item with a red dot, on every page) - the only place the pipeline needs you: a company page that now shows a different company, a Discovery result that matches an account by name only, possible duplicates, a LinkedIn company another account already uses, accounts lacking evidence (no LinkedIn company after two tries, or an empty page), and web findings the automatic rules leave open. One card at a time, with Skip; where several cases are truly the same (same field, same cause), a tick box applies the answer to all of them after a confirmation.</w:t>
+      </w:r>
+    </w:p>
+    <w:p>
+      <w:pPr>
+        <w:pStyle w:val="ListBullet"/>
+      </w:pPr>
+      <w:r>
+        <w:rPr>
+          <w:b/>
+        </w:rPr>
+        <w:t>Safer merging</w:t>
+      </w:r>
+      <w:r>
+        <w:t xml:space="preserve"> - Discovery results now merge by themselves when a run finishes, but only on a matching LinkedIn id; name-only matches wait in Decisions and no id is written onto an existing account without your answer. Duplicates merge on their own only when they share a re-checked LinkedIn id, and never when their links open different pages or their registry ids differ.</w:t>
+      </w:r>
+    </w:p>
+    <w:p>
+      <w:pPr>
+        <w:pStyle w:val="ListBullet"/>
+      </w:pPr>
+      <w:r>
+        <w:rPr>
+          <w:b/>
+        </w:rPr>
+        <w:t>Web research in the pipeline (optional)</w:t>
+      </w:r>
+      <w:r>
+        <w:t xml:space="preserve"> - a second switch in Settings &gt; Automation (and on the wizard's last step) researches accounts on the web with your own Anthropic API key, within a </w:t>
+      </w:r>
+      <w:r>
+        <w:rPr>
+          <w:b/>
+        </w:rPr>
+        <w:t>monthly US$ budget</w:t>
+      </w:r>
+      <w:r>
+        <w:t xml:space="preserve"> that is never exceeded (off by default; US$10 suggested). Missing headcounts and HQ countries get a short research first, then scannable accounts never researched or researched over 12 months ago get a full one, P1 first; P4/P5 are never researched automatically. Findings are resolved straight away with the automatic rules; a research that agrees with the current value now counts as confirming it. Research carries on after the LinkedIn limit is reached, without opening LinkedIn.</w:t>
+      </w:r>
+    </w:p>
+    <w:p>
+      <w:pPr>
+        <w:pStyle w:val="ListBullet"/>
+      </w:pPr>
+      <w:r>
+        <w:rPr>
+          <w:b/>
+        </w:rPr>
+        <w:t>Scanner gate</w:t>
+      </w:r>
+      <w:r>
+        <w:t xml:space="preserve"> - with 0 Ready accounts the Scanner explains why it cannot start; with 1-4 it explains and offers </w:t>
+      </w:r>
+      <w:r>
+        <w:rPr>
+          <w:b/>
+        </w:rPr>
+        <w:t>Scan anyway</w:t>
+      </w:r>
+      <w:r>
+        <w:t>. Discovered companies with a P1-P3 priority are now scanned too.</w:t>
+      </w:r>
+    </w:p>
+    <w:p>
+      <w:pPr>
+        <w:pStyle w:val="ListBullet"/>
+      </w:pPr>
+      <w:r>
+        <w:rPr>
+          <w:b/>
+        </w:rPr>
+        <w:t>Tidier menus</w:t>
+      </w:r>
+      <w:r>
+        <w:t xml:space="preserve"> - Review &amp; Merge Discovery Results, Resolve LinkedIn Company IDs, Fetch Company Size, Discover Contacts for Existing Companies and Find &amp; Merge Duplicates move to Advanced tools, fully working, each noting that the automatic pipeline normally does this for you. </w:t>
+      </w:r>
+      <w:r>
+        <w:rPr>
+          <w:b/>
+        </w:rPr>
+        <w:t>Run pipeline now</w:t>
+      </w:r>
+      <w:r>
+        <w:t xml:space="preserve"> (Advanced tools) runs a chosen number of accounts on demand.</w:t>
+      </w:r>
+    </w:p>
+    <w:p>
+      <w:pPr>
+        <w:pStyle w:val="ListBullet"/>
+      </w:pPr>
+      <w:r>
+        <w:rPr>
+          <w:b/>
+        </w:rPr>
+        <w:t>Alternative names</w:t>
+      </w:r>
+      <w:r>
+        <w:t xml:space="preserve"> - when LinkedIn finds no confident match for an account's name, the resolver also tries its alternative names (from the workbook, or typed on the account as Alt. name), so an account such as "Swiss Air-Rescue Rega" can be linked to its page "Rega".</w:t>
+      </w:r>
+    </w:p>
+    <w:p>
+      <w:pPr>
+        <w:pStyle w:val="ListBullet"/>
+      </w:pPr>
+      <w:r>
+        <w:rPr>
+          <w:b/>
+        </w:rPr>
+        <w:t>Fixed</w:t>
+      </w:r>
+      <w:r>
+        <w:t xml:space="preserve"> - LinkedIn's new "Name: Overview | LinkedIn" page titles made ten company look-ups give up (Stadler, Sunrise, SIG and others); company counts such as "6,500+" are read correctly when looking for missing sizes; contact relevance reads the research's own Seniority column first, and any "Chief … Officer" title counts as C-level; automatic scoring also refreshes locally computed priorities (never a manual override or an AI-judged score).</w:t>
+      </w:r>
+    </w:p>
+    <w:p>
+      <w:pPr>
+        <w:pStyle w:val="ListBullet"/>
+      </w:pPr>
+      <w:r>
+        <w:rPr>
+          <w:b/>
+        </w:rPr>
+        <w:t>Contact Link</w:t>
+      </w:r>
+      <w:r>
+        <w:t xml:space="preserve"> - the contact column "LinkedIn Profile" is now "Contact Link"; it shows "LinkedIn ↗" only for a real profile and the site name for any other page.</w:t>
+      </w:r>
+    </w:p>
+    <w:p>
+      <w:pPr>
+        <w:pStyle w:val="ListBullet"/>
+      </w:pPr>
+      <w:r>
+        <w:rPr>
+          <w:b/>
+        </w:rPr>
+        <w:t>Wording</w:t>
+      </w:r>
+      <w:r>
+        <w:t xml:space="preserve"> - the store listing, website, Help and Setup wizard describe account preparation as the one thing that runs by itself, after your consent, within your daily LinkedIn limit and visible in your browser. Posts and Jobs scans still run only when you click. No new permissions.</w:t>
+      </w:r>
+    </w:p>
     <w:p>
       <w:pPr>
         <w:pStyle w:val="Heading1"/>

</xml_diff>

<commit_message>
1.2.4.11 release notes (builds 1.2.4.7-1.2.4.11)
Co-Authored-By: Claude Opus 5.5 <noreply@anthropic.com>
</commit_message>
<xml_diff>
--- a/RELEASE_NOTES.docx
+++ b/RELEASE_NOTES.docx
@@ -2,6 +2,254 @@
 <file path=word/document.xml><?xml version="1.0" encoding="utf-8"?>
 <w:document xmlns:wpc="http://schemas.microsoft.com/office/word/2010/wordprocessingCanvas" xmlns:mo="http://schemas.microsoft.com/office/mac/office/2008/main" xmlns:mc="http://schemas.openxmlformats.org/markup-compatibility/2006" xmlns:mv="urn:schemas-microsoft-com:mac:vml" xmlns:o="urn:schemas-microsoft-com:office:office" xmlns:r="http://schemas.openxmlformats.org/officeDocument/2006/relationships" xmlns:m="http://schemas.openxmlformats.org/officeDocument/2006/math" xmlns:v="urn:schemas-microsoft-com:vml" xmlns:wp14="http://schemas.microsoft.com/office/word/2010/wordprocessingDrawing" xmlns:wp="http://schemas.openxmlformats.org/drawingml/2006/wordprocessingDrawing" xmlns:w10="urn:schemas-microsoft-com:office:word" xmlns:w="http://schemas.openxmlformats.org/wordprocessingml/2006/main" xmlns:w14="http://schemas.microsoft.com/office/word/2010/wordml" xmlns:wpg="http://schemas.microsoft.com/office/word/2010/wordprocessingGroup" xmlns:wpi="http://schemas.microsoft.com/office/word/2010/wordprocessingInk" xmlns:wne="http://schemas.microsoft.com/office/word/2006/wordml" xmlns:wps="http://schemas.microsoft.com/office/word/2010/wordprocessingShape" mc:Ignorable="w14 wp14">
   <w:body>
+    <w:p>
+      <w:pPr>
+        <w:pStyle w:val="Heading1"/>
+      </w:pPr>
+      <w:r>
+        <w:t>SalesTeam — v1.2.4.11</w:t>
+      </w:r>
+    </w:p>
+    <w:p>
+      <w:pPr>
+        <w:pStyle w:val="Heading2"/>
+      </w:pPr>
+      <w:r>
+        <w:t>Leads where you work: on account and contact pages, and in the export (builds 1.2.4.7-1.2.4.9)</w:t>
+      </w:r>
+    </w:p>
+    <w:p>
+      <w:pPr>
+        <w:pStyle w:val="ListBullet"/>
+      </w:pPr>
+      <w:r>
+        <w:rPr>
+          <w:b/>
+        </w:rPr>
+        <w:t>Leads on the account page</w:t>
+      </w:r>
+      <w:r>
+        <w:t xml:space="preserve"> - a new </w:t>
+      </w:r>
+      <w:r>
+        <w:rPr>
+          <w:b/>
+        </w:rPr>
+        <w:t>Leads</w:t>
+      </w:r>
+      <w:r>
+        <w:t xml:space="preserve"> section under Contacts lists every post and job listing from that company, newest first, with date, source, author, title, the start of the text, status and priority. Click a row to open the lead.</w:t>
+      </w:r>
+    </w:p>
+    <w:p>
+      <w:pPr>
+        <w:pStyle w:val="ListBullet"/>
+      </w:pPr>
+      <w:r>
+        <w:rPr>
+          <w:b/>
+        </w:rPr>
+        <w:t>Leads on the contact page</w:t>
+      </w:r>
+      <w:r>
+        <w:t xml:space="preserve"> - "Posts by this contact" is now </w:t>
+      </w:r>
+      <w:r>
+        <w:rPr>
+          <w:b/>
+        </w:rPr>
+        <w:t>Leads (Posts) by this contact</w:t>
+      </w:r>
+      <w:r>
+        <w:t>, the same table.</w:t>
+      </w:r>
+    </w:p>
+    <w:p>
+      <w:pPr>
+        <w:pStyle w:val="ListBullet"/>
+      </w:pPr>
+      <w:r>
+        <w:rPr>
+          <w:b/>
+        </w:rPr>
+        <w:t>The lead page</w:t>
+      </w:r>
+      <w:r>
+        <w:t xml:space="preserve"> - headed </w:t>
+      </w:r>
+      <w:r>
+        <w:rPr>
+          <w:b/>
+        </w:rPr>
+        <w:t>Lead</w:t>
+      </w:r>
+      <w:r>
+        <w:t>, with the lead's account at the top ("Account: Novartis", a link to the account page when it is one of your target accounts). A lead opened from an account or contact page opens in the same tab, and you go back to that page from the path line at the top.</w:t>
+      </w:r>
+    </w:p>
+    <w:p>
+      <w:pPr>
+        <w:pStyle w:val="ListBullet"/>
+      </w:pPr>
+      <w:r>
+        <w:rPr>
+          <w:b/>
+        </w:rPr>
+        <w:t>Leads in the Excel export</w:t>
+      </w:r>
+      <w:r>
+        <w:t xml:space="preserve"> - the SalesTeam Excel workbook has a fourth sheet, </w:t>
+      </w:r>
+      <w:r>
+        <w:rPr>
+          <w:b/>
+        </w:rPr>
+        <w:t>Leads</w:t>
+      </w:r>
+      <w:r>
+        <w:t>: the leads of the exported accounts, linked to them by Company ID. Import… leaves this sheet alone - leads come from scans, not files.</w:t>
+      </w:r>
+    </w:p>
+    <w:p>
+      <w:pPr>
+        <w:pStyle w:val="Heading2"/>
+      </w:pPr>
+      <w:r>
+        <w:t>Find your way: page names and a path at the top (builds 1.2.4.9-1.2.4.11)</w:t>
+      </w:r>
+    </w:p>
+    <w:p>
+      <w:pPr>
+        <w:pStyle w:val="ListBullet"/>
+      </w:pPr>
+      <w:r>
+        <w:rPr>
+          <w:b/>
+        </w:rPr>
+        <w:t>Each page says what it is</w:t>
+      </w:r>
+      <w:r>
+        <w:t xml:space="preserve"> - the heading and the browser tab name the page you are on - "Account", "Contact", "Lead", "SalesTeam Settings → Automation" - not the list you came from. A page opened from the menu gives the tab its own title.</w:t>
+      </w:r>
+    </w:p>
+    <w:p>
+      <w:pPr>
+        <w:pStyle w:val="ListBullet"/>
+      </w:pPr>
+      <w:r>
+        <w:rPr>
+          <w:b/>
+        </w:rPr>
+        <w:t>A path under the heading</w:t>
+      </w:r>
+      <w:r>
+        <w:t xml:space="preserve"> - for example "Target Accounts Dashboard › Novartis › Rui Costa". Click any part of it to go back to that level. It replaces the "Back to …" links.</w:t>
+      </w:r>
+    </w:p>
+    <w:p>
+      <w:pPr>
+        <w:pStyle w:val="ListBullet"/>
+      </w:pPr>
+      <w:r>
+        <w:rPr>
+          <w:b/>
+        </w:rPr>
+        <w:t>Straight to the page</w:t>
+      </w:r>
+      <w:r>
+        <w:t xml:space="preserve"> - going back to an account or contact no longer shows the accounts list for a few seconds first, and lines that belong to the list (its description, "LinkedIn company IDs resolved") are no longer shown on account and contact pages.</w:t>
+      </w:r>
+    </w:p>
+    <w:p>
+      <w:pPr>
+        <w:pStyle w:val="Heading2"/>
+      </w:pPr>
+      <w:r>
+        <w:t>Scanner: this scan's leads first (build 1.2.4.8)</w:t>
+      </w:r>
+    </w:p>
+    <w:p>
+      <w:pPr>
+        <w:pStyle w:val="ListBullet"/>
+      </w:pPr>
+      <w:r>
+        <w:rPr>
+          <w:b/>
+        </w:rPr>
+        <w:t>What this scan found</w:t>
+      </w:r>
+      <w:r>
+        <w:t xml:space="preserve"> - above the results: "1 new lead found in this scan, all leads in SalesTeam (209)". The switch </w:t>
+      </w:r>
+      <w:r>
+        <w:rPr>
+          <w:b/>
+        </w:rPr>
+        <w:t>Show only this scan's leads</w:t>
+      </w:r>
+      <w:r>
+        <w:t xml:space="preserve"> is on whenever the Scanner opens; untick it to see every lead. </w:t>
+      </w:r>
+      <w:r>
+        <w:rPr>
+          <w:b/>
+        </w:rPr>
+        <w:t>Export Leads (CSV)</w:t>
+      </w:r>
+      <w:r>
+        <w:t xml:space="preserve"> exports the leads listed.</w:t>
+      </w:r>
+    </w:p>
+    <w:p>
+      <w:pPr>
+        <w:pStyle w:val="Heading2"/>
+      </w:pPr>
+      <w:r>
+        <w:t>Smaller fixes (builds 1.2.4.9-1.2.4.10)</w:t>
+      </w:r>
+    </w:p>
+    <w:p>
+      <w:pPr>
+        <w:pStyle w:val="ListBullet"/>
+      </w:pPr>
+      <w:r>
+        <w:rPr>
+          <w:b/>
+        </w:rPr>
+        <w:t>No error after a reload</w:t>
+      </w:r>
+      <w:r>
+        <w:t xml:space="preserve"> - reloading SalesTeam while a LinkedIn search tab from a scan was still open no longer leaves an error on the extension card.</w:t>
+      </w:r>
+    </w:p>
+    <w:p>
+      <w:pPr>
+        <w:pStyle w:val="ListBullet"/>
+      </w:pPr>
+      <w:r>
+        <w:rPr>
+          <w:b/>
+        </w:rPr>
+        <w:t>Leads Dashboard in the menu</w:t>
+      </w:r>
+      <w:r>
+        <w:t xml:space="preserve"> works from a lead's page again (it did nothing there).</w:t>
+      </w:r>
+    </w:p>
+    <w:p>
+      <w:pPr>
+        <w:pStyle w:val="ListBullet"/>
+      </w:pPr>
+      <w:r>
+        <w:rPr>
+          <w:b/>
+        </w:rPr>
+        <w:t>Follow-up due</w:t>
+      </w:r>
+      <w:r>
+        <w:t xml:space="preserve"> - its Save button stays inside the card.</w:t>
+      </w:r>
+    </w:p>
     <w:p>
       <w:pPr>
         <w:pStyle w:val="Heading1"/>

</xml_diff>